<commit_message>
docs: actualizar CV (DOCX y PDF) y regenerar imagen de previsualizacion interactiva
</commit_message>
<xml_diff>
--- a/public/docs/Carlos_Juarez_CV.docx
+++ b/public/docs/Carlos_Juarez_CV.docx
@@ -2146,6 +2146,56 @@
       <w:r>
         <w:rPr>
           <w:rFonts w:ascii="Calibri Light" w:eastAsia="SimSun" w:hAnsi="Calibri Light" w:cs="Calibri Light"/>
+          <w:b/>
+          <w:bCs/>
+          <w:color w:val="000000"/>
+          <w:sz w:val="20"/>
+          <w:szCs w:val="20"/>
+          <w:lang w:val="es-ES"/>
+        </w:rPr>
+        <w:t>Backend</w:t>
+      </w:r>
+      <w:proofErr w:type="spellEnd"/>
+      <w:r>
+        <w:rPr>
+          <w:rFonts w:ascii="Calibri Light" w:eastAsia="SimSun" w:hAnsi="Calibri Light" w:cs="Calibri Light"/>
+          <w:b/>
+          <w:bCs/>
+          <w:color w:val="000000"/>
+          <w:sz w:val="20"/>
+          <w:szCs w:val="20"/>
+          <w:lang w:val="es-ES"/>
+        </w:rPr>
+        <w:t xml:space="preserve"> con PHP - PHP, Laravel, </w:t>
+      </w:r>
+      <w:r>
+        <w:rPr>
+          <w:rFonts w:ascii="Calibri Light" w:eastAsia="SimSun" w:hAnsi="Calibri Light"/>
+          <w:b/>
+          <w:bCs/>
+          <w:color w:val="000000"/>
+          <w:sz w:val="20"/>
+          <w:szCs w:val="20"/>
+          <w:lang w:val="es-ES"/>
+        </w:rPr>
+        <w:t>MySQL</w:t>
+      </w:r>
+      <w:r>
+        <w:rPr>
+          <w:rFonts w:ascii="Calibri Light" w:eastAsia="SimSun" w:hAnsi="Calibri Light" w:cs="Calibri Light"/>
+          <w:i/>
+          <w:iCs/>
+          <w:color w:val="000000"/>
+          <w:sz w:val="20"/>
+          <w:szCs w:val="20"/>
+          <w:lang w:val="es-ES"/>
+        </w:rPr>
+        <w:t xml:space="preserve"> - </w:t>
+      </w:r>
+      <w:proofErr w:type="spellStart"/>
+      <w:r>
+        <w:rPr>
+          <w:rFonts w:ascii="Calibri Light" w:eastAsia="SimSun" w:hAnsi="Calibri Light" w:cs="Calibri Light"/>
           <w:i/>
           <w:iCs/>
           <w:color w:val="000000"/>
@@ -2174,31 +2224,6 @@
       <w:proofErr w:type="spellStart"/>
       <w:r>
         <w:rPr>
-          <w:rFonts w:ascii="Calibri Light" w:eastAsia="SimSun" w:hAnsi="Calibri Light" w:cs="Calibri Light"/>
-          <w:b/>
-          <w:bCs/>
-          <w:color w:val="000000"/>
-          <w:sz w:val="20"/>
-          <w:szCs w:val="20"/>
-          <w:lang w:val="es-ES"/>
-        </w:rPr>
-        <w:t>Backend</w:t>
-      </w:r>
-      <w:proofErr w:type="spellEnd"/>
-      <w:r>
-        <w:rPr>
-          <w:rFonts w:ascii="Calibri Light" w:eastAsia="SimSun" w:hAnsi="Calibri Light" w:cs="Calibri Light"/>
-          <w:b/>
-          <w:bCs/>
-          <w:color w:val="000000"/>
-          <w:sz w:val="20"/>
-          <w:szCs w:val="20"/>
-          <w:lang w:val="es-ES"/>
-        </w:rPr>
-        <w:t xml:space="preserve"> con PHP - PHP, Laravel, </w:t>
-      </w:r>
-      <w:r>
-        <w:rPr>
           <w:rFonts w:ascii="Calibri Light" w:eastAsia="SimSun" w:hAnsi="Calibri Light"/>
           <w:b/>
           <w:bCs/>
@@ -2207,24 +2232,61 @@
           <w:szCs w:val="20"/>
           <w:lang w:val="es-ES"/>
         </w:rPr>
-        <w:t>MySQL</w:t>
-      </w:r>
-      <w:r>
-        <w:rPr>
-          <w:rFonts w:ascii="Calibri Light" w:eastAsia="SimSun" w:hAnsi="Calibri Light" w:cs="Calibri Light"/>
-          <w:i/>
-          <w:iCs/>
+        <w:t>Backend</w:t>
+      </w:r>
+      <w:proofErr w:type="spellEnd"/>
+      <w:r>
+        <w:rPr>
+          <w:rFonts w:ascii="Calibri Light" w:eastAsia="SimSun" w:hAnsi="Calibri Light"/>
+          <w:b/>
+          <w:bCs/>
           <w:color w:val="000000"/>
           <w:sz w:val="20"/>
           <w:szCs w:val="20"/>
           <w:lang w:val="es-ES"/>
         </w:rPr>
+        <w:t xml:space="preserve"> con Java - Java, Spring Boot, </w:t>
+      </w:r>
+      <w:proofErr w:type="spellStart"/>
+      <w:r>
+        <w:rPr>
+          <w:rFonts w:ascii="Calibri Light" w:eastAsia="SimSun" w:hAnsi="Calibri Light"/>
+          <w:b/>
+          <w:bCs/>
+          <w:color w:val="000000"/>
+          <w:sz w:val="20"/>
+          <w:szCs w:val="20"/>
+          <w:lang w:val="es-ES"/>
+        </w:rPr>
+        <w:t>Testing</w:t>
+      </w:r>
+      <w:proofErr w:type="spellEnd"/>
+      <w:r>
+        <w:rPr>
+          <w:rFonts w:ascii="Calibri Light" w:eastAsia="SimSun" w:hAnsi="Calibri Light"/>
+          <w:b/>
+          <w:bCs/>
+          <w:color w:val="000000"/>
+          <w:sz w:val="20"/>
+          <w:szCs w:val="20"/>
+          <w:lang w:val="es-ES"/>
+        </w:rPr>
+        <w:t xml:space="preserve"> E2E</w:t>
+      </w:r>
+      <w:r>
+        <w:rPr>
+          <w:rFonts w:ascii="Calibri Light" w:eastAsia="SimSun" w:hAnsi="Calibri Light"/>
+          <w:color w:val="000000"/>
+          <w:sz w:val="20"/>
+          <w:szCs w:val="20"/>
+          <w:lang w:val="es-ES"/>
+        </w:rPr>
         <w:t xml:space="preserve"> - </w:t>
       </w:r>
       <w:proofErr w:type="spellStart"/>
       <w:r>
         <w:rPr>
-          <w:rFonts w:ascii="Calibri Light" w:eastAsia="SimSun" w:hAnsi="Calibri Light" w:cs="Calibri Light"/>
+          <w:rFonts w:ascii="Calibri Light" w:eastAsia="SimSun" w:hAnsi="Calibri Light"/>
           <w:i/>
           <w:iCs/>
           <w:color w:val="000000"/>
@@ -2250,10 +2312,9 @@
           <w:lang w:val="es-ES"/>
         </w:rPr>
       </w:pPr>
-      <w:proofErr w:type="spellStart"/>
-      <w:r>
-        <w:rPr>
-          <w:rFonts w:ascii="Calibri Light" w:eastAsia="SimSun" w:hAnsi="Calibri Light"/>
+      <w:r>
+        <w:rPr>
+          <w:rFonts w:ascii="Calibri Light" w:eastAsia="SimSun" w:hAnsi="Calibri Light" w:cs="Calibri Light"/>
           <w:b/>
           <w:bCs/>
           <w:color w:val="000000"/>
@@ -2261,12 +2322,12 @@
           <w:szCs w:val="20"/>
           <w:lang w:val="es-ES"/>
         </w:rPr>
-        <w:t>Backend</w:t>
-      </w:r>
-      <w:proofErr w:type="spellEnd"/>
-      <w:r>
-        <w:rPr>
-          <w:rFonts w:ascii="Calibri Light" w:eastAsia="SimSun" w:hAnsi="Calibri Light"/>
+        <w:t xml:space="preserve">Data </w:t>
+      </w:r>
+      <w:proofErr w:type="spellStart"/>
+      <w:r>
+        <w:rPr>
+          <w:rFonts w:ascii="Calibri Light" w:eastAsia="SimSun" w:hAnsi="Calibri Light" w:cs="Calibri Light"/>
           <w:b/>
           <w:bCs/>
           <w:color w:val="000000"/>
@@ -2274,12 +2335,12 @@
           <w:szCs w:val="20"/>
           <w:lang w:val="es-ES"/>
         </w:rPr>
-        <w:t xml:space="preserve"> con Java - Java, Spring Boot, </w:t>
-      </w:r>
-      <w:proofErr w:type="spellStart"/>
-      <w:r>
-        <w:rPr>
-          <w:rFonts w:ascii="Calibri Light" w:eastAsia="SimSun" w:hAnsi="Calibri Light"/>
+        <w:t>Science</w:t>
+      </w:r>
+      <w:proofErr w:type="spellEnd"/>
+      <w:r>
+        <w:rPr>
+          <w:rFonts w:ascii="Calibri Light" w:eastAsia="SimSun" w:hAnsi="Calibri Light" w:cs="Calibri Light"/>
           <w:b/>
           <w:bCs/>
           <w:color w:val="000000"/>
@@ -2287,12 +2348,12 @@
           <w:szCs w:val="20"/>
           <w:lang w:val="es-ES"/>
         </w:rPr>
-        <w:t>Testing</w:t>
-      </w:r>
-      <w:proofErr w:type="spellEnd"/>
-      <w:r>
-        <w:rPr>
-          <w:rFonts w:ascii="Calibri Light" w:eastAsia="SimSun" w:hAnsi="Calibri Light"/>
+        <w:t xml:space="preserve"> e IA - Python, Machine </w:t>
+      </w:r>
+      <w:proofErr w:type="spellStart"/>
+      <w:r>
+        <w:rPr>
+          <w:rFonts w:ascii="Calibri Light" w:eastAsia="SimSun" w:hAnsi="Calibri Light" w:cs="Calibri Light"/>
           <w:b/>
           <w:bCs/>
           <w:color w:val="000000"/>
@@ -2300,22 +2361,103 @@
           <w:szCs w:val="20"/>
           <w:lang w:val="es-ES"/>
         </w:rPr>
-        <w:t xml:space="preserve"> E2E</w:t>
-      </w:r>
-      <w:r>
-        <w:rPr>
-          <w:rFonts w:ascii="Calibri Light" w:eastAsia="SimSun" w:hAnsi="Calibri Light"/>
+        <w:t>Learning</w:t>
+      </w:r>
+      <w:proofErr w:type="spellEnd"/>
+      <w:r>
+        <w:rPr>
+          <w:rFonts w:ascii="Calibri Light" w:eastAsia="SimSun" w:hAnsi="Calibri Light" w:cs="Calibri Light"/>
+          <w:b/>
+          <w:bCs/>
           <w:color w:val="000000"/>
           <w:sz w:val="20"/>
           <w:szCs w:val="20"/>
           <w:lang w:val="es-ES"/>
         </w:rPr>
+        <w:t xml:space="preserve">, Data </w:t>
+      </w:r>
+      <w:proofErr w:type="spellStart"/>
+      <w:r>
+        <w:rPr>
+          <w:rFonts w:ascii="Calibri Light" w:eastAsia="SimSun" w:hAnsi="Calibri Light" w:cs="Calibri Light"/>
+          <w:b/>
+          <w:bCs/>
+          <w:color w:val="000000"/>
+          <w:sz w:val="20"/>
+          <w:szCs w:val="20"/>
+          <w:lang w:val="es-ES"/>
+        </w:rPr>
+        <w:t>Science</w:t>
+      </w:r>
+      <w:proofErr w:type="spellEnd"/>
+      <w:r>
+        <w:rPr>
+          <w:rFonts w:ascii="Calibri Light" w:eastAsia="SimSun" w:hAnsi="Calibri Light" w:cs="Calibri Light"/>
+          <w:b/>
+          <w:bCs/>
+          <w:color w:val="000000"/>
+          <w:sz w:val="20"/>
+          <w:szCs w:val="20"/>
+          <w:lang w:val="es-ES"/>
+        </w:rPr>
+        <w:t xml:space="preserve">, </w:t>
+      </w:r>
+      <w:proofErr w:type="spellStart"/>
+      <w:r>
+        <w:rPr>
+          <w:rFonts w:ascii="Calibri Light" w:eastAsia="SimSun" w:hAnsi="Calibri Light" w:cs="Calibri Light"/>
+          <w:b/>
+          <w:bCs/>
+          <w:color w:val="000000"/>
+          <w:sz w:val="20"/>
+          <w:szCs w:val="20"/>
+          <w:lang w:val="es-ES"/>
+        </w:rPr>
+        <w:t>TensorFlow</w:t>
+      </w:r>
+      <w:proofErr w:type="spellEnd"/>
+      <w:r>
+        <w:rPr>
+          <w:rFonts w:ascii="Calibri Light" w:eastAsia="SimSun" w:hAnsi="Calibri Light" w:cs="Calibri Light"/>
+          <w:b/>
+          <w:bCs/>
+          <w:color w:val="000000"/>
+          <w:sz w:val="20"/>
+          <w:szCs w:val="20"/>
+          <w:lang w:val="es-ES"/>
+        </w:rPr>
+        <w:t xml:space="preserve"> y </w:t>
+      </w:r>
+      <w:proofErr w:type="spellStart"/>
+      <w:r>
+        <w:rPr>
+          <w:rFonts w:ascii="Calibri Light" w:eastAsia="SimSun" w:hAnsi="Calibri Light" w:cs="Calibri Light"/>
+          <w:b/>
+          <w:bCs/>
+          <w:color w:val="000000"/>
+          <w:sz w:val="20"/>
+          <w:szCs w:val="20"/>
+          <w:lang w:val="es-ES"/>
+        </w:rPr>
+        <w:t>PyTorch</w:t>
+      </w:r>
+      <w:proofErr w:type="spellEnd"/>
+      <w:r>
+        <w:rPr>
+          <w:rFonts w:ascii="Calibri Light" w:eastAsia="SimSun" w:hAnsi="Calibri Light" w:cs="Calibri Light"/>
+          <w:i/>
+          <w:iCs/>
+          <w:color w:val="000000"/>
+          <w:sz w:val="20"/>
+          <w:szCs w:val="20"/>
+          <w:lang w:val="es-ES"/>
+        </w:rPr>
         <w:t xml:space="preserve"> - </w:t>
       </w:r>
       <w:proofErr w:type="spellStart"/>
       <w:r>
         <w:rPr>
-          <w:rFonts w:ascii="Calibri Light" w:eastAsia="SimSun" w:hAnsi="Calibri Light"/>
+          <w:rFonts w:ascii="Calibri Light" w:eastAsia="SimSun" w:hAnsi="Calibri Light" w:cs="Calibri Light"/>
           <w:i/>
           <w:iCs/>
           <w:color w:val="000000"/>
@@ -2351,126 +2493,8 @@
           <w:szCs w:val="20"/>
           <w:lang w:val="es-ES"/>
         </w:rPr>
-        <w:t xml:space="preserve">Data </w:t>
-      </w:r>
-      <w:proofErr w:type="spellStart"/>
-      <w:r>
-        <w:rPr>
-          <w:rFonts w:ascii="Calibri Light" w:eastAsia="SimSun" w:hAnsi="Calibri Light" w:cs="Calibri Light"/>
-          <w:b/>
-          <w:bCs/>
-          <w:color w:val="000000"/>
-          <w:sz w:val="20"/>
-          <w:szCs w:val="20"/>
-          <w:lang w:val="es-ES"/>
-        </w:rPr>
-        <w:t>Science</w:t>
-      </w:r>
-      <w:proofErr w:type="spellEnd"/>
-      <w:r>
-        <w:rPr>
-          <w:rFonts w:ascii="Calibri Light" w:eastAsia="SimSun" w:hAnsi="Calibri Light" w:cs="Calibri Light"/>
-          <w:b/>
-          <w:bCs/>
-          <w:color w:val="000000"/>
-          <w:sz w:val="20"/>
-          <w:szCs w:val="20"/>
-          <w:lang w:val="es-ES"/>
-        </w:rPr>
-        <w:t xml:space="preserve"> e IA - Python, Machine </w:t>
-      </w:r>
-      <w:proofErr w:type="spellStart"/>
-      <w:r>
-        <w:rPr>
-          <w:rFonts w:ascii="Calibri Light" w:eastAsia="SimSun" w:hAnsi="Calibri Light" w:cs="Calibri Light"/>
-          <w:b/>
-          <w:bCs/>
-          <w:color w:val="000000"/>
-          <w:sz w:val="20"/>
-          <w:szCs w:val="20"/>
-          <w:lang w:val="es-ES"/>
-        </w:rPr>
-        <w:t>Learning</w:t>
-      </w:r>
-      <w:proofErr w:type="spellEnd"/>
-      <w:r>
-        <w:rPr>
-          <w:rFonts w:ascii="Calibri Light" w:eastAsia="SimSun" w:hAnsi="Calibri Light" w:cs="Calibri Light"/>
-          <w:b/>
-          <w:bCs/>
-          <w:color w:val="000000"/>
-          <w:sz w:val="20"/>
-          <w:szCs w:val="20"/>
-          <w:lang w:val="es-ES"/>
-        </w:rPr>
-        <w:t xml:space="preserve">, Data </w:t>
-      </w:r>
-      <w:proofErr w:type="spellStart"/>
-      <w:r>
-        <w:rPr>
-          <w:rFonts w:ascii="Calibri Light" w:eastAsia="SimSun" w:hAnsi="Calibri Light" w:cs="Calibri Light"/>
-          <w:b/>
-          <w:bCs/>
-          <w:color w:val="000000"/>
-          <w:sz w:val="20"/>
-          <w:szCs w:val="20"/>
-          <w:lang w:val="es-ES"/>
-        </w:rPr>
-        <w:t>Science</w:t>
-      </w:r>
-      <w:proofErr w:type="spellEnd"/>
-      <w:r>
-        <w:rPr>
-          <w:rFonts w:ascii="Calibri Light" w:eastAsia="SimSun" w:hAnsi="Calibri Light" w:cs="Calibri Light"/>
-          <w:b/>
-          <w:bCs/>
-          <w:color w:val="000000"/>
-          <w:sz w:val="20"/>
-          <w:szCs w:val="20"/>
-          <w:lang w:val="es-ES"/>
-        </w:rPr>
-        <w:t xml:space="preserve">, </w:t>
-      </w:r>
-      <w:proofErr w:type="spellStart"/>
-      <w:r>
-        <w:rPr>
-          <w:rFonts w:ascii="Calibri Light" w:eastAsia="SimSun" w:hAnsi="Calibri Light" w:cs="Calibri Light"/>
-          <w:b/>
-          <w:bCs/>
-          <w:color w:val="000000"/>
-          <w:sz w:val="20"/>
-          <w:szCs w:val="20"/>
-          <w:lang w:val="es-ES"/>
-        </w:rPr>
-        <w:t>TensorFlow</w:t>
-      </w:r>
-      <w:proofErr w:type="spellEnd"/>
-      <w:r>
-        <w:rPr>
-          <w:rFonts w:ascii="Calibri Light" w:eastAsia="SimSun" w:hAnsi="Calibri Light" w:cs="Calibri Light"/>
-          <w:b/>
-          <w:bCs/>
-          <w:color w:val="000000"/>
-          <w:sz w:val="20"/>
-          <w:szCs w:val="20"/>
-          <w:lang w:val="es-ES"/>
-        </w:rPr>
-        <w:t xml:space="preserve"> y </w:t>
-      </w:r>
-      <w:proofErr w:type="spellStart"/>
-      <w:r>
-        <w:rPr>
-          <w:rFonts w:ascii="Calibri Light" w:eastAsia="SimSun" w:hAnsi="Calibri Light" w:cs="Calibri Light"/>
-          <w:b/>
-          <w:bCs/>
-          <w:color w:val="000000"/>
-          <w:sz w:val="20"/>
-          <w:szCs w:val="20"/>
-          <w:lang w:val="es-ES"/>
-        </w:rPr>
-        <w:t>PyTorch</w:t>
-      </w:r>
-      <w:proofErr w:type="spellEnd"/>
+        <w:t>Programación Web - HTML5, CSS3, JavaScript y Lógica de Programación</w:t>
+      </w:r>
       <w:r>
         <w:rPr>
           <w:rFonts w:ascii="Calibri Light" w:eastAsia="SimSun" w:hAnsi="Calibri Light" w:cs="Calibri Light"/>
@@ -2508,6 +2532,8 @@
         <w:jc w:val="both"/>
         <w:rPr>
           <w:rFonts w:ascii="Calibri Light" w:eastAsia="SimSun" w:hAnsi="Calibri Light" w:cs="Calibri Light"/>
+          <w:i/>
+          <w:iCs/>
           <w:color w:val="000000"/>
           <w:lang w:val="es-ES"/>
         </w:rPr>
@@ -2522,8 +2548,61 @@
           <w:szCs w:val="20"/>
           <w:lang w:val="es-ES"/>
         </w:rPr>
-        <w:t>Programación Web - HTML5, CSS3, JavaScript y Lógica de Programación</w:t>
-      </w:r>
+        <w:t>WordPress + SEO WordPress</w:t>
+      </w:r>
+      <w:r>
+        <w:rPr>
+          <w:rFonts w:ascii="Calibri Light" w:eastAsia="SimSun" w:hAnsi="Calibri Light" w:cs="Calibri Light"/>
+          <w:color w:val="000000"/>
+          <w:sz w:val="20"/>
+          <w:szCs w:val="20"/>
+          <w:lang w:val="es-ES"/>
+        </w:rPr>
+        <w:t xml:space="preserve"> </w:t>
+      </w:r>
+      <w:r>
+        <w:rPr>
+          <w:rFonts w:ascii="Calibri Light" w:eastAsia="SimSun" w:hAnsi="Calibri Light" w:cs="Calibri Light"/>
+          <w:color w:val="000000"/>
+          <w:sz w:val="20"/>
+          <w:szCs w:val="20"/>
+          <w:lang w:val="es-ES"/>
+        </w:rPr>
+        <w:t>y</w:t>
+      </w:r>
+      <w:r>
+        <w:rPr>
+          <w:rFonts w:ascii="Calibri Light" w:eastAsia="SimSun" w:hAnsi="Calibri Light" w:cs="Calibri Light"/>
+          <w:color w:val="000000"/>
+          <w:sz w:val="20"/>
+          <w:szCs w:val="20"/>
+          <w:lang w:val="es-ES"/>
+        </w:rPr>
+        <w:t xml:space="preserve"> </w:t>
+      </w:r>
+      <w:r>
+        <w:rPr>
+          <w:rFonts w:ascii="Calibri Light" w:eastAsia="SimSun" w:hAnsi="Calibri Light" w:cs="Calibri Light"/>
+          <w:b/>
+          <w:bCs/>
+          <w:color w:val="000000"/>
+          <w:sz w:val="20"/>
+          <w:szCs w:val="20"/>
+          <w:lang w:val="es-ES"/>
+        </w:rPr>
+        <w:t>Joomla + SEO Joomla</w:t>
+      </w:r>
+      <w:r>
+        <w:rPr>
+          <w:rFonts w:ascii="Calibri Light" w:eastAsia="SimSun" w:hAnsi="Calibri Light" w:cs="Calibri Light"/>
+          <w:color w:val="000000"/>
+          <w:sz w:val="20"/>
+          <w:szCs w:val="20"/>
+          <w:lang w:val="es-ES"/>
+        </w:rPr>
+        <w:t xml:space="preserve"> - </w:t>
+      </w:r>
+      <w:proofErr w:type="spellStart"/>
       <w:r>
         <w:rPr>
           <w:rFonts w:ascii="Calibri Light" w:eastAsia="SimSun" w:hAnsi="Calibri Light" w:cs="Calibri Light"/>
@@ -2534,20 +2613,7 @@
           <w:szCs w:val="20"/>
           <w:lang w:val="es-ES"/>
         </w:rPr>
-        <w:t xml:space="preserve"> - </w:t>
-      </w:r>
-      <w:proofErr w:type="spellStart"/>
-      <w:r>
-        <w:rPr>
-          <w:rFonts w:ascii="Calibri Light" w:eastAsia="SimSun" w:hAnsi="Calibri Light" w:cs="Calibri Light"/>
-          <w:i/>
-          <w:iCs/>
-          <w:color w:val="000000"/>
-          <w:sz w:val="20"/>
-          <w:szCs w:val="20"/>
-          <w:lang w:val="es-ES"/>
-        </w:rPr>
-        <w:t>EDteam</w:t>
+        <w:t>Complusoft</w:t>
       </w:r>
       <w:proofErr w:type="spellEnd"/>
     </w:p>
@@ -2577,38 +2643,9 @@
           <w:szCs w:val="20"/>
           <w:lang w:val="es-ES"/>
         </w:rPr>
-        <w:t>WordPress + SEO WordPress</w:t>
-      </w:r>
-      <w:r>
-        <w:rPr>
-          <w:rFonts w:ascii="Calibri Light" w:eastAsia="SimSun" w:hAnsi="Calibri Light" w:cs="Calibri Light"/>
-          <w:color w:val="000000"/>
-          <w:sz w:val="20"/>
-          <w:szCs w:val="20"/>
-          <w:lang w:val="es-ES"/>
-        </w:rPr>
-        <w:t xml:space="preserve"> </w:t>
-      </w:r>
-      <w:r>
-        <w:rPr>
-          <w:rFonts w:ascii="Calibri Light" w:eastAsia="SimSun" w:hAnsi="Calibri Light" w:cs="Calibri Light"/>
-          <w:color w:val="000000"/>
-          <w:sz w:val="20"/>
-          <w:szCs w:val="20"/>
-          <w:lang w:val="es-ES"/>
-        </w:rPr>
-        <w:t>y</w:t>
-      </w:r>
-      <w:r>
-        <w:rPr>
-          <w:rFonts w:ascii="Calibri Light" w:eastAsia="SimSun" w:hAnsi="Calibri Light" w:cs="Calibri Light"/>
-          <w:color w:val="000000"/>
-          <w:sz w:val="20"/>
-          <w:szCs w:val="20"/>
-          <w:lang w:val="es-ES"/>
-        </w:rPr>
-        <w:t xml:space="preserve"> </w:t>
-      </w:r>
+        <w:t xml:space="preserve">SOLARIS Fundamentals </w:t>
+      </w:r>
+      <w:proofErr w:type="spellStart"/>
       <w:r>
         <w:rPr>
           <w:rFonts w:ascii="Calibri Light" w:eastAsia="SimSun" w:hAnsi="Calibri Light" w:cs="Calibri Light"/>
@@ -2619,7 +2656,46 @@
           <w:szCs w:val="20"/>
           <w:lang w:val="es-ES"/>
         </w:rPr>
-        <w:t>Joomla + SEO Joomla</w:t>
+        <w:t>for</w:t>
+      </w:r>
+      <w:proofErr w:type="spellEnd"/>
+      <w:r>
+        <w:rPr>
+          <w:rFonts w:ascii="Calibri Light" w:eastAsia="SimSun" w:hAnsi="Calibri Light" w:cs="Calibri Light"/>
+          <w:b/>
+          <w:bCs/>
+          <w:color w:val="000000"/>
+          <w:sz w:val="20"/>
+          <w:szCs w:val="20"/>
+          <w:lang w:val="es-ES"/>
+        </w:rPr>
+        <w:t xml:space="preserve"> </w:t>
+      </w:r>
+      <w:proofErr w:type="spellStart"/>
+      <w:r>
+        <w:rPr>
+          <w:rFonts w:ascii="Calibri Light" w:eastAsia="SimSun" w:hAnsi="Calibri Light" w:cs="Calibri Light"/>
+          <w:b/>
+          <w:bCs/>
+          <w:color w:val="000000"/>
+          <w:sz w:val="20"/>
+          <w:szCs w:val="20"/>
+          <w:lang w:val="es-ES"/>
+        </w:rPr>
+        <w:t>Administrators</w:t>
+      </w:r>
+      <w:proofErr w:type="spellEnd"/>
+      <w:r>
+        <w:rPr>
+          <w:rFonts w:ascii="Calibri Light" w:eastAsia="SimSun" w:hAnsi="Calibri Light" w:cs="Calibri Light"/>
+          <w:b/>
+          <w:bCs/>
+          <w:color w:val="000000"/>
+          <w:sz w:val="20"/>
+          <w:szCs w:val="20"/>
+          <w:lang w:val="es-ES"/>
+        </w:rPr>
+        <w:t xml:space="preserve"> (SA-118)</w:t>
       </w:r>
       <w:r>
         <w:rPr>
@@ -2631,7 +2707,6 @@
         </w:rPr>
         <w:t xml:space="preserve"> - </w:t>
       </w:r>
-      <w:proofErr w:type="spellStart"/>
       <w:r>
         <w:rPr>
           <w:rFonts w:ascii="Calibri Light" w:eastAsia="SimSun" w:hAnsi="Calibri Light" w:cs="Calibri Light"/>
@@ -2642,9 +2717,8 @@
           <w:szCs w:val="20"/>
           <w:lang w:val="es-ES"/>
         </w:rPr>
-        <w:t>Complusoft</w:t>
-      </w:r>
-      <w:proofErr w:type="spellEnd"/>
+        <w:t>SUN Microsystems</w:t>
+      </w:r>
     </w:p>
     <w:p>
       <w:pPr>
@@ -2655,10 +2729,6 @@
         <w:spacing w:after="0" w:line="360" w:lineRule="auto"/>
         <w:jc w:val="both"/>
         <w:rPr>
-          <w:rFonts w:ascii="Calibri Light" w:eastAsia="SimSun" w:hAnsi="Calibri Light" w:cs="Calibri Light"/>
-          <w:i/>
-          <w:iCs/>
-          <w:color w:val="000000"/>
           <w:lang w:val="es-ES"/>
         </w:rPr>
       </w:pPr>
@@ -2672,7 +2742,7 @@
           <w:szCs w:val="20"/>
           <w:lang w:val="es-ES"/>
         </w:rPr>
-        <w:t xml:space="preserve">SOLARIS Fundamentals </w:t>
+        <w:t xml:space="preserve">SOLARIS 8 </w:t>
       </w:r>
       <w:proofErr w:type="spellStart"/>
       <w:r>
@@ -2685,7 +2755,7 @@
           <w:szCs w:val="20"/>
           <w:lang w:val="es-ES"/>
         </w:rPr>
-        <w:t>for</w:t>
+        <w:t>System</w:t>
       </w:r>
       <w:proofErr w:type="spellEnd"/>
       <w:r>
@@ -2711,7 +2781,7 @@
           <w:szCs w:val="20"/>
           <w:lang w:val="es-ES"/>
         </w:rPr>
-        <w:t>Administrators</w:t>
+        <w:t>Administration</w:t>
       </w:r>
       <w:proofErr w:type="spellEnd"/>
       <w:r>
@@ -2724,7 +2794,7 @@
           <w:szCs w:val="20"/>
           <w:lang w:val="es-ES"/>
         </w:rPr>
-        <w:t xml:space="preserve"> (SA-118)</w:t>
+        <w:t xml:space="preserve"> I y II (SA-238) y (SA-288)</w:t>
       </w:r>
       <w:r>
         <w:rPr>
@@ -2771,7 +2841,7 @@
           <w:szCs w:val="20"/>
           <w:lang w:val="es-ES"/>
         </w:rPr>
-        <w:t xml:space="preserve">SOLARIS 8 </w:t>
+        <w:t xml:space="preserve">SOLARIS 8 Network </w:t>
       </w:r>
       <w:proofErr w:type="spellStart"/>
       <w:r>
@@ -2784,7 +2854,7 @@
           <w:szCs w:val="20"/>
           <w:lang w:val="es-ES"/>
         </w:rPr>
-        <w:t>System</w:t>
+        <w:t>Administration</w:t>
       </w:r>
       <w:proofErr w:type="spellEnd"/>
       <w:r>
@@ -2797,33 +2867,7 @@
           <w:szCs w:val="20"/>
           <w:lang w:val="es-ES"/>
         </w:rPr>
-        <w:t xml:space="preserve"> </w:t>
-      </w:r>
-      <w:proofErr w:type="spellStart"/>
-      <w:r>
-        <w:rPr>
-          <w:rFonts w:ascii="Calibri Light" w:eastAsia="SimSun" w:hAnsi="Calibri Light" w:cs="Calibri Light"/>
-          <w:b/>
-          <w:bCs/>
-          <w:color w:val="000000"/>
-          <w:sz w:val="20"/>
-          <w:szCs w:val="20"/>
-          <w:lang w:val="es-ES"/>
-        </w:rPr>
-        <w:t>Administration</w:t>
-      </w:r>
-      <w:proofErr w:type="spellEnd"/>
-      <w:r>
-        <w:rPr>
-          <w:rFonts w:ascii="Calibri Light" w:eastAsia="SimSun" w:hAnsi="Calibri Light" w:cs="Calibri Light"/>
-          <w:b/>
-          <w:bCs/>
-          <w:color w:val="000000"/>
-          <w:sz w:val="20"/>
-          <w:szCs w:val="20"/>
-          <w:lang w:val="es-ES"/>
-        </w:rPr>
-        <w:t xml:space="preserve"> I y II (SA-238) y (SA-288)</w:t>
+        <w:t xml:space="preserve"> TCP/IP (SA-389)</w:t>
       </w:r>
       <w:r>
         <w:rPr>
@@ -2860,6 +2904,7 @@
           <w:lang w:val="es-ES"/>
         </w:rPr>
       </w:pPr>
+      <w:proofErr w:type="spellStart"/>
       <w:r>
         <w:rPr>
           <w:rFonts w:ascii="Calibri Light" w:eastAsia="SimSun" w:hAnsi="Calibri Light" w:cs="Calibri Light"/>
@@ -2870,9 +2915,9 @@
           <w:szCs w:val="20"/>
           <w:lang w:val="es-ES"/>
         </w:rPr>
-        <w:t xml:space="preserve">SOLARIS 8 Network </w:t>
-      </w:r>
-      <w:proofErr w:type="spellStart"/>
+        <w:t>Interconnecting</w:t>
+      </w:r>
+      <w:proofErr w:type="spellEnd"/>
       <w:r>
         <w:rPr>
           <w:rFonts w:ascii="Calibri Light" w:eastAsia="SimSun" w:hAnsi="Calibri Light" w:cs="Calibri Light"/>
@@ -2883,9 +2928,9 @@
           <w:szCs w:val="20"/>
           <w:lang w:val="es-ES"/>
         </w:rPr>
-        <w:t>Administration</w:t>
-      </w:r>
-      <w:proofErr w:type="spellEnd"/>
+        <w:t xml:space="preserve"> CISCO Network </w:t>
+      </w:r>
+      <w:proofErr w:type="spellStart"/>
       <w:r>
         <w:rPr>
           <w:rFonts w:ascii="Calibri Light" w:eastAsia="SimSun" w:hAnsi="Calibri Light" w:cs="Calibri Light"/>
@@ -2896,7 +2941,20 @@
           <w:szCs w:val="20"/>
           <w:lang w:val="es-ES"/>
         </w:rPr>
-        <w:t xml:space="preserve"> TCP/IP (SA-389)</w:t>
+        <w:t>Devices</w:t>
+      </w:r>
+      <w:proofErr w:type="spellEnd"/>
+      <w:r>
+        <w:rPr>
+          <w:rFonts w:ascii="Calibri Light" w:eastAsia="SimSun" w:hAnsi="Calibri Light" w:cs="Calibri Light"/>
+          <w:b/>
+          <w:bCs/>
+          <w:color w:val="000000"/>
+          <w:sz w:val="20"/>
+          <w:szCs w:val="20"/>
+          <w:lang w:val="es-ES"/>
+        </w:rPr>
+        <w:t xml:space="preserve"> (CCNA)</w:t>
       </w:r>
       <w:r>
         <w:rPr>
@@ -2918,7 +2976,7 @@
           <w:szCs w:val="20"/>
           <w:lang w:val="es-ES"/>
         </w:rPr>
-        <w:t>SUN Microsystems</w:t>
+        <w:t>AI2T</w:t>
       </w:r>
     </w:p>
     <w:p>
@@ -2930,10 +2988,13 @@
         <w:spacing w:after="0" w:line="360" w:lineRule="auto"/>
         <w:jc w:val="both"/>
         <w:rPr>
+          <w:rFonts w:ascii="Calibri Light" w:eastAsia="SimSun" w:hAnsi="Calibri Light" w:cs="Calibri Light"/>
+          <w:i/>
+          <w:iCs/>
+          <w:color w:val="000000"/>
           <w:lang w:val="es-ES"/>
         </w:rPr>
       </w:pPr>
-      <w:proofErr w:type="spellStart"/>
       <w:r>
         <w:rPr>
           <w:rFonts w:ascii="Calibri Light" w:eastAsia="SimSun" w:hAnsi="Calibri Light" w:cs="Calibri Light"/>
@@ -2944,9 +3005,18 @@
           <w:szCs w:val="20"/>
           <w:lang w:val="es-ES"/>
         </w:rPr>
-        <w:t>Interconnecting</w:t>
-      </w:r>
-      <w:proofErr w:type="spellEnd"/>
+        <w:t>ITIL Fundamentals</w:t>
+      </w:r>
+      <w:r>
+        <w:rPr>
+          <w:rFonts w:ascii="Calibri Light" w:eastAsia="SimSun" w:hAnsi="Calibri Light" w:cs="Calibri Light"/>
+          <w:color w:val="000000"/>
+          <w:sz w:val="20"/>
+          <w:szCs w:val="20"/>
+          <w:lang w:val="es-ES"/>
+        </w:rPr>
+        <w:t xml:space="preserve"> e </w:t>
+      </w:r>
       <w:r>
         <w:rPr>
           <w:rFonts w:ascii="Calibri Light" w:eastAsia="SimSun" w:hAnsi="Calibri Light" w:cs="Calibri Light"/>
@@ -2957,33 +3027,7 @@
           <w:szCs w:val="20"/>
           <w:lang w:val="es-ES"/>
         </w:rPr>
-        <w:t xml:space="preserve"> CISCO Network </w:t>
-      </w:r>
-      <w:proofErr w:type="spellStart"/>
-      <w:r>
-        <w:rPr>
-          <w:rFonts w:ascii="Calibri Light" w:eastAsia="SimSun" w:hAnsi="Calibri Light" w:cs="Calibri Light"/>
-          <w:b/>
-          <w:bCs/>
-          <w:color w:val="000000"/>
-          <w:sz w:val="20"/>
-          <w:szCs w:val="20"/>
-          <w:lang w:val="es-ES"/>
-        </w:rPr>
-        <w:t>Devices</w:t>
-      </w:r>
-      <w:proofErr w:type="spellEnd"/>
-      <w:r>
-        <w:rPr>
-          <w:rFonts w:ascii="Calibri Light" w:eastAsia="SimSun" w:hAnsi="Calibri Light" w:cs="Calibri Light"/>
-          <w:b/>
-          <w:bCs/>
-          <w:color w:val="000000"/>
-          <w:sz w:val="20"/>
-          <w:szCs w:val="20"/>
-          <w:lang w:val="es-ES"/>
-        </w:rPr>
-        <w:t xml:space="preserve"> (CCNA)</w:t>
+        <w:t>Implantación y Seguridad en Redes Wireless</w:t>
       </w:r>
       <w:r>
         <w:rPr>
@@ -3005,7 +3049,7 @@
           <w:szCs w:val="20"/>
           <w:lang w:val="es-ES"/>
         </w:rPr>
-        <w:t>AI2T</w:t>
+        <w:t>Telefónica</w:t>
       </w:r>
     </w:p>
     <w:p>
@@ -3017,68 +3061,42 @@
         <w:spacing w:after="0" w:line="360" w:lineRule="auto"/>
         <w:jc w:val="both"/>
         <w:rPr>
+          <w:lang w:val="es-ES"/>
+        </w:rPr>
+      </w:pPr>
+      <w:r>
+        <w:rPr>
+          <w:rFonts w:ascii="Calibri Light" w:eastAsia="SimSun" w:hAnsi="Calibri Light" w:cs="Calibri Light"/>
+          <w:b/>
+          <w:bCs/>
+          <w:color w:val="000000"/>
+          <w:sz w:val="20"/>
+          <w:szCs w:val="20"/>
+          <w:lang w:val="es-ES"/>
+        </w:rPr>
+        <w:t>Administración de Seguridad en Exchange (MOC5049-5051)</w:t>
+      </w:r>
+      <w:r>
+        <w:rPr>
+          <w:rFonts w:ascii="Calibri Light" w:eastAsia="SimSun" w:hAnsi="Calibri Light" w:cs="Calibri Light"/>
+          <w:color w:val="000000"/>
+          <w:sz w:val="20"/>
+          <w:szCs w:val="20"/>
+          <w:lang w:val="es-ES"/>
+        </w:rPr>
+        <w:t xml:space="preserve"> - </w:t>
+      </w:r>
+      <w:r>
+        <w:rPr>
           <w:rFonts w:ascii="Calibri Light" w:eastAsia="SimSun" w:hAnsi="Calibri Light" w:cs="Calibri Light"/>
           <w:i/>
           <w:iCs/>
           <w:color w:val="000000"/>
+          <w:sz w:val="20"/>
+          <w:szCs w:val="20"/>
           <w:lang w:val="es-ES"/>
         </w:rPr>
-      </w:pPr>
-      <w:r>
-        <w:rPr>
-          <w:rFonts w:ascii="Calibri Light" w:eastAsia="SimSun" w:hAnsi="Calibri Light" w:cs="Calibri Light"/>
-          <w:b/>
-          <w:bCs/>
-          <w:color w:val="000000"/>
-          <w:sz w:val="20"/>
-          <w:szCs w:val="20"/>
-          <w:lang w:val="es-ES"/>
-        </w:rPr>
-        <w:t>ITIL Fundamentals</w:t>
-      </w:r>
-      <w:r>
-        <w:rPr>
-          <w:rFonts w:ascii="Calibri Light" w:eastAsia="SimSun" w:hAnsi="Calibri Light" w:cs="Calibri Light"/>
-          <w:color w:val="000000"/>
-          <w:sz w:val="20"/>
-          <w:szCs w:val="20"/>
-          <w:lang w:val="es-ES"/>
-        </w:rPr>
-        <w:t xml:space="preserve"> e </w:t>
-      </w:r>
-      <w:r>
-        <w:rPr>
-          <w:rFonts w:ascii="Calibri Light" w:eastAsia="SimSun" w:hAnsi="Calibri Light" w:cs="Calibri Light"/>
-          <w:b/>
-          <w:bCs/>
-          <w:color w:val="000000"/>
-          <w:sz w:val="20"/>
-          <w:szCs w:val="20"/>
-          <w:lang w:val="es-ES"/>
-        </w:rPr>
-        <w:t>Implantación y Seguridad en Redes Wireless</w:t>
-      </w:r>
-      <w:r>
-        <w:rPr>
-          <w:rFonts w:ascii="Calibri Light" w:eastAsia="SimSun" w:hAnsi="Calibri Light" w:cs="Calibri Light"/>
-          <w:color w:val="000000"/>
-          <w:sz w:val="20"/>
-          <w:szCs w:val="20"/>
-          <w:lang w:val="es-ES"/>
-        </w:rPr>
-        <w:t xml:space="preserve"> - </w:t>
-      </w:r>
-      <w:r>
-        <w:rPr>
-          <w:rFonts w:ascii="Calibri Light" w:eastAsia="SimSun" w:hAnsi="Calibri Light" w:cs="Calibri Light"/>
-          <w:i/>
-          <w:iCs/>
-          <w:color w:val="000000"/>
-          <w:sz w:val="20"/>
-          <w:szCs w:val="20"/>
-          <w:lang w:val="es-ES"/>
-        </w:rPr>
-        <w:t>Telefónica</w:t>
+        <w:t>Indra Sistemas</w:t>
       </w:r>
     </w:p>
     <w:p>
@@ -3090,53 +3108,6 @@
         <w:spacing w:after="0" w:line="360" w:lineRule="auto"/>
         <w:jc w:val="both"/>
         <w:rPr>
-          <w:lang w:val="es-ES"/>
-        </w:rPr>
-      </w:pPr>
-      <w:r>
-        <w:rPr>
-          <w:rFonts w:ascii="Calibri Light" w:eastAsia="SimSun" w:hAnsi="Calibri Light" w:cs="Calibri Light"/>
-          <w:b/>
-          <w:bCs/>
-          <w:color w:val="000000"/>
-          <w:sz w:val="20"/>
-          <w:szCs w:val="20"/>
-          <w:lang w:val="es-ES"/>
-        </w:rPr>
-        <w:t>Administración de Seguridad en Exchange (MOC5049-5051)</w:t>
-      </w:r>
-      <w:r>
-        <w:rPr>
-          <w:rFonts w:ascii="Calibri Light" w:eastAsia="SimSun" w:hAnsi="Calibri Light" w:cs="Calibri Light"/>
-          <w:color w:val="000000"/>
-          <w:sz w:val="20"/>
-          <w:szCs w:val="20"/>
-          <w:lang w:val="es-ES"/>
-        </w:rPr>
-        <w:t xml:space="preserve"> - </w:t>
-      </w:r>
-      <w:r>
-        <w:rPr>
-          <w:rFonts w:ascii="Calibri Light" w:eastAsia="SimSun" w:hAnsi="Calibri Light" w:cs="Calibri Light"/>
-          <w:i/>
-          <w:iCs/>
-          <w:color w:val="000000"/>
-          <w:sz w:val="20"/>
-          <w:szCs w:val="20"/>
-          <w:lang w:val="es-ES"/>
-        </w:rPr>
-        <w:t>Indra Sistemas</w:t>
-      </w:r>
-    </w:p>
-    <w:p>
-      <w:pPr>
-        <w:numPr>
-          <w:ilvl w:val="0"/>
-          <w:numId w:val="22"/>
-        </w:numPr>
-        <w:spacing w:after="0" w:line="360" w:lineRule="auto"/>
-        <w:jc w:val="both"/>
-        <w:rPr>
           <w:rFonts w:ascii="Calibri Light" w:eastAsia="SimSun" w:hAnsi="Calibri Light" w:cs="Calibri Light"/>
           <w:i/>
           <w:iCs/>
@@ -3182,13 +3153,14 @@
     <w:p>
       <w:pPr>
         <w:spacing w:after="0" w:line="360" w:lineRule="auto"/>
-        <w:ind w:left="420"/>
         <w:jc w:val="both"/>
         <w:rPr>
           <w:rFonts w:ascii="Calibri Light" w:eastAsia="SimSun" w:hAnsi="Calibri Light" w:cs="Calibri Light"/>
           <w:i/>
           <w:iCs/>
           <w:color w:val="000000"/>
+          <w:sz w:val="16"/>
+          <w:szCs w:val="16"/>
           <w:lang w:val="es-ES"/>
         </w:rPr>
       </w:pPr>
@@ -3922,19 +3894,6 @@
     </w:p>
     <w:p>
       <w:pPr>
-        <w:pStyle w:val="Prrafodelista"/>
-        <w:ind w:left="1440"/>
-        <w:rPr>
-          <w:rFonts w:asciiTheme="majorHAnsi" w:hAnsiTheme="majorHAnsi" w:cstheme="majorHAnsi"/>
-          <w:b/>
-          <w:bCs/>
-          <w:sz w:val="20"/>
-          <w:szCs w:val="20"/>
-        </w:rPr>
-      </w:pPr>
-    </w:p>
-    <w:p>
-      <w:pPr>
         <w:jc w:val="both"/>
         <w:rPr>
           <w:rFonts w:asciiTheme="majorHAnsi" w:hAnsiTheme="majorHAnsi" w:cstheme="majorHAnsi"/>
@@ -4037,11 +3996,11 @@
           <w:rFonts w:asciiTheme="majorHAnsi" w:hAnsiTheme="majorHAnsi" w:cstheme="majorHAnsi"/>
           <w:b/>
           <w:bCs/>
-          <w:sz w:val="20"/>
-          <w:szCs w:val="20"/>
-        </w:rPr>
-      </w:pPr>
-      <w:proofErr w:type="gramStart"/>
+          <w:color w:val="1F497D" w:themeColor="text2"/>
+          <w:sz w:val="20"/>
+          <w:szCs w:val="20"/>
+        </w:rPr>
+      </w:pPr>
       <w:r>
         <w:rPr>
           <w:rFonts w:asciiTheme="majorHAnsi" w:hAnsiTheme="majorHAnsi" w:cstheme="majorHAnsi"/>
@@ -4053,54 +4012,62 @@
         </w:rPr>
         <w:t>CONTACTO</w:t>
       </w:r>
-      <w:r>
-        <w:rPr>
-          <w:rFonts w:asciiTheme="majorHAnsi" w:hAnsiTheme="majorHAnsi" w:cstheme="majorHAnsi"/>
-          <w:b/>
-          <w:bCs/>
-          <w:sz w:val="20"/>
-          <w:szCs w:val="20"/>
-        </w:rPr>
-        <w:t xml:space="preserve"> </w:t>
-      </w:r>
-      <w:r>
-        <w:rPr>
-          <w:rFonts w:asciiTheme="majorHAnsi" w:hAnsiTheme="majorHAnsi" w:cstheme="majorHAnsi"/>
-          <w:i/>
-          <w:iCs/>
-          <w:sz w:val="20"/>
-          <w:szCs w:val="20"/>
-        </w:rPr>
-        <w:t xml:space="preserve"> </w:t>
-      </w:r>
-      <w:r>
-        <w:rPr>
-          <w:rFonts w:asciiTheme="majorHAnsi" w:hAnsiTheme="majorHAnsi" w:cstheme="majorHAnsi"/>
-          <w:i/>
-          <w:iCs/>
-          <w:sz w:val="20"/>
-          <w:szCs w:val="20"/>
-        </w:rPr>
-        <w:t>e-mail</w:t>
-      </w:r>
-      <w:proofErr w:type="gramEnd"/>
-      <w:r>
-        <w:rPr>
-          <w:rFonts w:asciiTheme="majorHAnsi" w:hAnsiTheme="majorHAnsi" w:cstheme="majorHAnsi"/>
-          <w:i/>
-          <w:iCs/>
-          <w:sz w:val="20"/>
-          <w:szCs w:val="20"/>
-        </w:rPr>
-        <w:t xml:space="preserve">: </w:t>
+    </w:p>
+    <w:p>
+      <w:pPr>
+        <w:spacing w:line="240" w:lineRule="auto"/>
+        <w:jc w:val="center"/>
+        <w:rPr>
+          <w:rFonts w:asciiTheme="majorHAnsi" w:hAnsiTheme="majorHAnsi" w:cstheme="majorHAnsi"/>
+          <w:sz w:val="20"/>
+          <w:szCs w:val="20"/>
+        </w:rPr>
+      </w:pPr>
+      <w:proofErr w:type="spellStart"/>
+      <w:r>
+        <w:rPr>
+          <w:sz w:val="18"/>
+          <w:szCs w:val="18"/>
+        </w:rPr>
+        <w:t>Tef</w:t>
+      </w:r>
+      <w:proofErr w:type="spellEnd"/>
+      <w:r>
+        <w:rPr>
+          <w:sz w:val="18"/>
+          <w:szCs w:val="18"/>
+        </w:rPr>
+        <w:t xml:space="preserve">.: </w:t>
+      </w:r>
+      <w:r>
+        <w:rPr>
+          <w:rFonts w:asciiTheme="majorHAnsi" w:hAnsiTheme="majorHAnsi" w:cstheme="majorHAnsi"/>
+          <w:sz w:val="18"/>
+          <w:szCs w:val="18"/>
+        </w:rPr>
+        <w:t>+34 689 501 11</w:t>
+      </w:r>
+      <w:r>
+        <w:rPr>
+          <w:rFonts w:asciiTheme="majorHAnsi" w:hAnsiTheme="majorHAnsi" w:cstheme="majorHAnsi"/>
+          <w:sz w:val="18"/>
+          <w:szCs w:val="18"/>
+        </w:rPr>
+        <w:t xml:space="preserve"> - </w:t>
+      </w:r>
+      <w:r>
+        <w:rPr>
+          <w:rFonts w:asciiTheme="majorHAnsi" w:hAnsiTheme="majorHAnsi" w:cstheme="majorHAnsi"/>
+          <w:sz w:val="20"/>
+          <w:szCs w:val="20"/>
+        </w:rPr>
+        <w:t xml:space="preserve">e-mail: </w:t>
       </w:r>
       <w:hyperlink r:id="rId8" w:history="1">
         <w:r>
           <w:rPr>
             <w:rStyle w:val="Hipervnculo"/>
             <w:rFonts w:asciiTheme="majorHAnsi" w:hAnsiTheme="majorHAnsi" w:cstheme="majorHAnsi"/>
-            <w:i/>
-            <w:iCs/>
             <w:sz w:val="18"/>
             <w:szCs w:val="18"/>
           </w:rPr>
@@ -4109,64 +4076,115 @@
       </w:hyperlink>
       <w:r>
         <w:rPr>
-          <w:i/>
-          <w:iCs/>
-          <w:sz w:val="18"/>
-          <w:szCs w:val="18"/>
-        </w:rPr>
-        <w:t xml:space="preserve"> </w:t>
-      </w:r>
-      <w:r>
-        <w:rPr>
-          <w:i/>
-          <w:iCs/>
-          <w:sz w:val="18"/>
-          <w:szCs w:val="18"/>
-        </w:rPr>
-        <w:t xml:space="preserve">– </w:t>
+          <w:rFonts w:asciiTheme="majorHAnsi" w:hAnsiTheme="majorHAnsi" w:cstheme="majorHAnsi"/>
+          <w:sz w:val="20"/>
+          <w:szCs w:val="20"/>
+        </w:rPr>
+        <w:t xml:space="preserve">                                                                                                                     </w:t>
       </w:r>
       <w:proofErr w:type="spellStart"/>
       <w:r>
         <w:rPr>
-          <w:i/>
-          <w:iCs/>
-          <w:sz w:val="18"/>
-          <w:szCs w:val="18"/>
-        </w:rPr>
-        <w:t>Tef</w:t>
+          <w:rFonts w:asciiTheme="majorHAnsi" w:hAnsiTheme="majorHAnsi" w:cstheme="majorHAnsi"/>
+          <w:sz w:val="20"/>
+          <w:szCs w:val="20"/>
+        </w:rPr>
+        <w:t>Linked</w:t>
+      </w:r>
+      <w:r>
+        <w:rPr>
+          <w:rFonts w:asciiTheme="majorHAnsi" w:hAnsiTheme="majorHAnsi" w:cstheme="majorHAnsi"/>
+          <w:sz w:val="20"/>
+          <w:szCs w:val="20"/>
+        </w:rPr>
+        <w:t>l</w:t>
+      </w:r>
+      <w:r>
+        <w:rPr>
+          <w:rFonts w:asciiTheme="majorHAnsi" w:hAnsiTheme="majorHAnsi" w:cstheme="majorHAnsi"/>
+          <w:sz w:val="20"/>
+          <w:szCs w:val="20"/>
+        </w:rPr>
+        <w:t>n</w:t>
       </w:r>
       <w:proofErr w:type="spellEnd"/>
       <w:r>
         <w:rPr>
-          <w:i/>
-          <w:iCs/>
-          <w:sz w:val="18"/>
-          <w:szCs w:val="18"/>
-        </w:rPr>
-        <w:t>.:</w:t>
-      </w:r>
-      <w:r>
-        <w:rPr>
-          <w:i/>
-          <w:iCs/>
-          <w:sz w:val="18"/>
-          <w:szCs w:val="18"/>
-        </w:rPr>
-        <w:t xml:space="preserve"> </w:t>
-      </w:r>
-      <w:r>
-        <w:rPr>
-          <w:rFonts w:asciiTheme="majorHAnsi" w:hAnsiTheme="majorHAnsi" w:cstheme="majorHAnsi"/>
-          <w:i/>
-          <w:iCs/>
-          <w:sz w:val="18"/>
-          <w:szCs w:val="18"/>
-        </w:rPr>
-        <w:t>+34 689 501 110</w:t>
-      </w:r>
+          <w:rFonts w:asciiTheme="majorHAnsi" w:hAnsiTheme="majorHAnsi" w:cstheme="majorHAnsi"/>
+          <w:sz w:val="20"/>
+          <w:szCs w:val="20"/>
+        </w:rPr>
+        <w:t xml:space="preserve">: </w:t>
+      </w:r>
+      <w:hyperlink r:id="rId9" w:history="1">
+        <w:r>
+          <w:rPr>
+            <w:rStyle w:val="Hipervnculo"/>
+            <w:rFonts w:asciiTheme="majorHAnsi" w:hAnsiTheme="majorHAnsi" w:cstheme="majorHAnsi"/>
+            <w:sz w:val="20"/>
+            <w:szCs w:val="20"/>
+          </w:rPr>
+          <w:t>https://www.linkedin.com/in/carlosj-juarez/</w:t>
+        </w:r>
+      </w:hyperlink>
+      <w:r>
+        <w:rPr>
+          <w:rFonts w:asciiTheme="majorHAnsi" w:hAnsiTheme="majorHAnsi" w:cstheme="majorHAnsi"/>
+          <w:sz w:val="20"/>
+          <w:szCs w:val="20"/>
+        </w:rPr>
+        <w:t xml:space="preserve"> - </w:t>
+      </w:r>
+      <w:proofErr w:type="gramStart"/>
+      <w:r>
+        <w:rPr>
+          <w:rFonts w:asciiTheme="majorHAnsi" w:hAnsiTheme="majorHAnsi" w:cstheme="majorHAnsi"/>
+          <w:sz w:val="20"/>
+          <w:szCs w:val="20"/>
+        </w:rPr>
+        <w:t>Portfolio</w:t>
+      </w:r>
+      <w:proofErr w:type="gramEnd"/>
+      <w:r>
+        <w:rPr>
+          <w:rFonts w:asciiTheme="majorHAnsi" w:hAnsiTheme="majorHAnsi" w:cstheme="majorHAnsi"/>
+          <w:sz w:val="20"/>
+          <w:szCs w:val="20"/>
+        </w:rPr>
+        <w:t xml:space="preserve">: </w:t>
+      </w:r>
+      <w:hyperlink r:id="rId10" w:history="1">
+        <w:r>
+          <w:rPr>
+            <w:rStyle w:val="Hipervnculo"/>
+            <w:rFonts w:asciiTheme="majorHAnsi" w:hAnsiTheme="majorHAnsi" w:cstheme="majorHAnsi"/>
+            <w:sz w:val="20"/>
+            <w:szCs w:val="20"/>
+          </w:rPr>
+          <w:t>https://portfolio-1rrp.</w:t>
+        </w:r>
+        <w:r>
+          <w:rPr>
+            <w:rStyle w:val="Hipervnculo"/>
+            <w:rFonts w:asciiTheme="majorHAnsi" w:hAnsiTheme="majorHAnsi" w:cstheme="majorHAnsi"/>
+            <w:sz w:val="20"/>
+            <w:szCs w:val="20"/>
+          </w:rPr>
+          <w:t>o</w:t>
+        </w:r>
+        <w:r>
+          <w:rPr>
+            <w:rStyle w:val="Hipervnculo"/>
+            <w:rFonts w:asciiTheme="majorHAnsi" w:hAnsiTheme="majorHAnsi" w:cstheme="majorHAnsi"/>
+            <w:sz w:val="20"/>
+            <w:szCs w:val="20"/>
+          </w:rPr>
+          <w:t>nrender.com/</w:t>
+        </w:r>
+      </w:hyperlink>
     </w:p>
     <w:sectPr>
-      <w:footerReference w:type="default" r:id="rId9"/>
+      <w:footerReference w:type="default" r:id="rId11"/>
       <w:pgSz w:w="12240" w:h="15840"/>
       <w:pgMar w:top="1440" w:right="1080" w:bottom="1440" w:left="1080" w:header="720" w:footer="720" w:gutter="0"/>
       <w:cols w:space="720"/>
@@ -17346,6 +17364,18 @@
       <w:lang w:val="es-ES" w:eastAsia="es-ES"/>
     </w:rPr>
   </w:style>
+  <w:style w:type="character" w:styleId="Hipervnculovisitado">
+    <w:name w:val="FollowedHyperlink"/>
+    <w:basedOn w:val="Fuentedeprrafopredeter"/>
+    <w:uiPriority w:val="99"/>
+    <w:semiHidden/>
+    <w:unhideWhenUsed/>
+    <w:rsid w:val="00182DD8"/>
+    <w:rPr>
+      <w:color w:val="800080" w:themeColor="followedHyperlink"/>
+      <w:u w:val="single"/>
+    </w:rPr>
+  </w:style>
 </w:styles>
 </file>
 

</xml_diff>